<commit_message>
Match Weekly Report template to actual submitted format
Restyled to match the CleanCAD Week 2 report that was actually
submitted: bold "CleanCAD (Week __ – __/__)" subtitle (no checkmark
icon), and body cells with the light blue-gray background and
dash/dot bullet structure used in the real submission. Content is
bracketed placeholders, easy to swap out each week.
</commit_message>
<xml_diff>
--- a/docs/Weekly_Report_Template.docx
+++ b/docs/Weekly_Report_Template.docx
@@ -26,29 +26,28 @@
     </w:p>
     <w:p>
       <w:pPr>
-        <w:spacing w:after="200"/>
+        <w:spacing w:after="160"/>
       </w:pPr>
     </w:p>
     <w:p>
       <w:pPr>
-        <w:spacing w:after="240"/>
+        <w:spacing w:after="200"/>
       </w:pPr>
       <w:r>
         <w:rPr>
           <w:b/>
           <w:bCs/>
-          <w:color w:val="6B8E23"/>
           <w:sz w:val="30"/>
           <w:szCs w:val="30"/>
         </w:rPr>
-        <w:t xml:space="preserve">✓  </w:t>
+        <w:t xml:space="preserve">CleanCAD</w:t>
       </w:r>
       <w:r>
         <w:rPr>
           <w:sz w:val="30"/>
           <w:szCs w:val="30"/>
         </w:rPr>
-        <w:t xml:space="preserve">Team-2 (Week __ – __/__)</w:t>
+        <w:t xml:space="preserve"> (Week __ – __/__)</w:t>
       </w:r>
     </w:p>
     <w:tbl>
@@ -160,78 +159,86 @@
           </w:tcPr>
           <w:p>
             <w:pPr>
-              <w:spacing w:after="160"/>
-            </w:pPr>
-            <w:r>
-              <w:rPr>
-                <w:i/>
-                <w:iCs/>
-                <w:color w:val="808080"/>
-                <w:sz w:val="22"/>
-                <w:szCs w:val="22"/>
-              </w:rPr>
-              <w:t xml:space="preserve">- Work completed this week</w:t>
-            </w:r>
-          </w:p>
-          <w:p>
-            <w:pPr>
-              <w:spacing w:after="160"/>
-            </w:pPr>
-            <w:r>
-              <w:rPr>
-                <w:i/>
-                <w:iCs/>
-                <w:color w:val="808080"/>
-                <w:sz w:val="22"/>
-                <w:szCs w:val="22"/>
-              </w:rPr>
-              <w:t xml:space="preserve">  . Item – completion date</w:t>
-            </w:r>
-          </w:p>
-          <w:p>
-            <w:pPr>
-              <w:spacing w:after="160"/>
-            </w:pPr>
-            <w:r>
-              <w:rPr>
-                <w:i/>
-                <w:iCs/>
-                <w:color w:val="808080"/>
-                <w:sz w:val="22"/>
-                <w:szCs w:val="22"/>
-              </w:rPr>
-              <w:t xml:space="preserve"/>
-            </w:r>
-          </w:p>
-          <w:p>
-            <w:pPr>
-              <w:spacing w:after="160"/>
-            </w:pPr>
-            <w:r>
-              <w:rPr>
-                <w:i/>
-                <w:iCs/>
-                <w:color w:val="808080"/>
-                <w:sz w:val="22"/>
-                <w:szCs w:val="22"/>
-              </w:rPr>
-              <w:t xml:space="preserve">- Issues / blockers</w:t>
-            </w:r>
-          </w:p>
-          <w:p>
-            <w:pPr>
-              <w:spacing w:after="160"/>
-            </w:pPr>
-            <w:r>
-              <w:rPr>
-                <w:i/>
-                <w:iCs/>
-                <w:color w:val="808080"/>
-                <w:sz w:val="22"/>
-                <w:szCs w:val="22"/>
-              </w:rPr>
-              <w:t xml:space="preserve">  . Details</w:t>
-            </w:r>
+              <w:spacing w:after="40"/>
+            </w:pPr>
+            <w:r>
+              <w:rPr>
+                <w:b/>
+                <w:bCs/>
+                <w:sz w:val="21"/>
+                <w:szCs w:val="21"/>
+              </w:rPr>
+              <w:t xml:space="preserve">-[Task 1] (date)</w:t>
+            </w:r>
+          </w:p>
+          <w:p>
+            <w:pPr>
+              <w:spacing w:after="40"/>
+              <w:ind w:left="150"/>
+            </w:pPr>
+            <w:r>
+              <w:rPr>
+                <w:sz w:val="20"/>
+                <w:szCs w:val="20"/>
+              </w:rPr>
+              <w:t xml:space="preserve">. [status / completed]</w:t>
+            </w:r>
+          </w:p>
+          <w:p>
+            <w:pPr>
+              <w:spacing w:after="120"/>
+            </w:pPr>
+          </w:p>
+          <w:p>
+            <w:pPr>
+              <w:spacing w:after="40"/>
+            </w:pPr>
+            <w:r>
+              <w:rPr>
+                <w:b/>
+                <w:bCs/>
+                <w:sz w:val="21"/>
+                <w:szCs w:val="21"/>
+              </w:rPr>
+              <w:t xml:space="preserve">-[Task 2] (date)</w:t>
+            </w:r>
+          </w:p>
+          <w:p>
+            <w:pPr>
+              <w:spacing w:after="40"/>
+              <w:ind w:left="150"/>
+            </w:pPr>
+            <w:r>
+              <w:rPr>
+                <w:sz w:val="20"/>
+                <w:szCs w:val="20"/>
+              </w:rPr>
+              <w:t xml:space="preserve">. [progress detail — e.g. X/Y modules]</w:t>
+            </w:r>
+          </w:p>
+          <w:p>
+            <w:pPr>
+              <w:spacing w:after="120"/>
+            </w:pPr>
+          </w:p>
+          <w:p>
+            <w:pPr>
+              <w:spacing w:after="40"/>
+            </w:pPr>
+            <w:r>
+              <w:rPr>
+                <w:b/>
+                <w:bCs/>
+                <w:sz w:val="21"/>
+                <w:szCs w:val="21"/>
+              </w:rPr>
+              <w:t xml:space="preserve">-[Task 3] (date)</w:t>
+            </w:r>
+          </w:p>
+          <w:p>
+            <w:pPr>
+              <w:spacing w:after="120"/>
+            </w:pPr>
           </w:p>
         </w:tc>
         <w:tc>
@@ -253,78 +260,86 @@
           </w:tcPr>
           <w:p>
             <w:pPr>
-              <w:spacing w:after="160"/>
-            </w:pPr>
-            <w:r>
-              <w:rPr>
-                <w:i/>
-                <w:iCs/>
-                <w:color w:val="808080"/>
-                <w:sz w:val="22"/>
-                <w:szCs w:val="22"/>
-              </w:rPr>
-              <w:t xml:space="preserve">- Plan for next week</w:t>
-            </w:r>
-          </w:p>
-          <w:p>
-            <w:pPr>
-              <w:spacing w:after="160"/>
-            </w:pPr>
-            <w:r>
-              <w:rPr>
-                <w:i/>
-                <w:iCs/>
-                <w:color w:val="808080"/>
-                <w:sz w:val="22"/>
-                <w:szCs w:val="22"/>
-              </w:rPr>
-              <w:t xml:space="preserve">  . Item – target date</w:t>
-            </w:r>
-          </w:p>
-          <w:p>
-            <w:pPr>
-              <w:spacing w:after="160"/>
-            </w:pPr>
-            <w:r>
-              <w:rPr>
-                <w:i/>
-                <w:iCs/>
-                <w:color w:val="808080"/>
-                <w:sz w:val="22"/>
-                <w:szCs w:val="22"/>
-              </w:rPr>
-              <w:t xml:space="preserve"/>
-            </w:r>
-          </w:p>
-          <w:p>
-            <w:pPr>
-              <w:spacing w:after="160"/>
-            </w:pPr>
-            <w:r>
-              <w:rPr>
-                <w:i/>
-                <w:iCs/>
-                <w:color w:val="808080"/>
-                <w:sz w:val="22"/>
-                <w:szCs w:val="22"/>
-              </w:rPr>
-              <w:t xml:space="preserve">- Items needing confirmation</w:t>
-            </w:r>
-          </w:p>
-          <w:p>
-            <w:pPr>
-              <w:spacing w:after="160"/>
-            </w:pPr>
-            <w:r>
-              <w:rPr>
-                <w:i/>
-                <w:iCs/>
-                <w:color w:val="808080"/>
-                <w:sz w:val="22"/>
-                <w:szCs w:val="22"/>
-              </w:rPr>
-              <w:t xml:space="preserve">  . Details</w:t>
-            </w:r>
+              <w:spacing w:after="40"/>
+            </w:pPr>
+            <w:r>
+              <w:rPr>
+                <w:b/>
+                <w:bCs/>
+                <w:sz w:val="21"/>
+                <w:szCs w:val="21"/>
+              </w:rPr>
+              <w:t xml:space="preserve">-[Task 1] (target date)</w:t>
+            </w:r>
+          </w:p>
+          <w:p>
+            <w:pPr>
+              <w:spacing w:after="40"/>
+              <w:ind w:left="150"/>
+            </w:pPr>
+            <w:r>
+              <w:rPr>
+                <w:sz w:val="20"/>
+                <w:szCs w:val="20"/>
+              </w:rPr>
+              <w:t xml:space="preserve">. [what needs to be done]</w:t>
+            </w:r>
+          </w:p>
+          <w:p>
+            <w:pPr>
+              <w:spacing w:after="120"/>
+            </w:pPr>
+          </w:p>
+          <w:p>
+            <w:pPr>
+              <w:spacing w:after="40"/>
+            </w:pPr>
+            <w:r>
+              <w:rPr>
+                <w:b/>
+                <w:bCs/>
+                <w:sz w:val="21"/>
+                <w:szCs w:val="21"/>
+              </w:rPr>
+              <w:t xml:space="preserve">-[Task 2] (target date)</w:t>
+            </w:r>
+          </w:p>
+          <w:p>
+            <w:pPr>
+              <w:spacing w:after="40"/>
+              <w:ind w:left="150"/>
+            </w:pPr>
+            <w:r>
+              <w:rPr>
+                <w:sz w:val="20"/>
+                <w:szCs w:val="20"/>
+              </w:rPr>
+              <w:t xml:space="preserve">. [what needs to be done]</w:t>
+            </w:r>
+          </w:p>
+          <w:p>
+            <w:pPr>
+              <w:spacing w:after="120"/>
+            </w:pPr>
+          </w:p>
+          <w:p>
+            <w:pPr>
+              <w:spacing w:after="40"/>
+            </w:pPr>
+            <w:r>
+              <w:rPr>
+                <w:b/>
+                <w:bCs/>
+                <w:sz w:val="21"/>
+                <w:szCs w:val="21"/>
+              </w:rPr>
+              <w:t xml:space="preserve">-[Task 3] (target date)</w:t>
+            </w:r>
+          </w:p>
+          <w:p>
+            <w:pPr>
+              <w:spacing w:after="120"/>
+            </w:pPr>
           </w:p>
         </w:tc>
       </w:tr>

</xml_diff>